<commit_message>
docs: organize AIInfra resume and interview intro
</commit_message>
<xml_diff>
--- a/doc/Haoran_Feng_AIInfra_Resume.docx
+++ b/doc/Haoran_Feng_AIInfra_Resume.docx
@@ -41,8 +41,8 @@
               <w:rPr>
                 <w:rFonts w:ascii="Times New Roman" w:eastAsia="宋体" w:hAnsi="Times New Roman" w:cs="Times New Roman"/>
                 <w:bCs/>
-                <w:sz w:val="20"/>
-                <w:szCs w:val="20"/>
+                <w:sz w:val="52"/>
+                <w:szCs w:val="52"/>
               </w:rPr>
             </w:pPr>
             <w:r>
@@ -50,8 +50,8 @@
                 <w:rFonts w:ascii="Times New Roman" w:eastAsia="宋体" w:hAnsi="Times New Roman" w:cs="Times New Roman"/>
                 <w:bCs/>
                 <w:noProof/>
-                <w:sz w:val="20"/>
-                <w:szCs w:val="20"/>
+                <w:sz w:val="52"/>
+                <w:szCs w:val="52"/>
               </w:rPr>
               <w:t>Haoran Feng</w:t>
             </w:r>
@@ -83,7 +83,7 @@
             </w:pPr>
             <w:r>
               <w:rPr>
-                <w:rFonts w:ascii="宋体" w:eastAsia="宋体" w:hAnsi="宋体" w:cstheme="minorHAnsi" w:hint="eastAsia"/>
+                <w:rFonts w:ascii="Times New Roman" w:eastAsia="宋体" w:hAnsi="Times New Roman" w:cstheme="minorHAnsi" w:hint="eastAsia"/>
                 <w:bCs/>
                 <w:sz w:val="20"/>
                 <w:szCs w:val="20"/>
@@ -94,7 +94,7 @@
               <w:r>
                 <w:rPr>
                   <w:rStyle w:val="ab"/>
-                  <w:rFonts w:ascii="宋体" w:eastAsia="宋体" w:hAnsi="宋体" w:cstheme="minorHAnsi"/>
+                  <w:rFonts w:ascii="Times New Roman" w:eastAsia="宋体" w:hAnsi="Times New Roman" w:cstheme="minorHAnsi"/>
                   <w:bCs/>
                   <w:sz w:val="20"/>
                   <w:szCs w:val="20"/>
@@ -104,7 +104,7 @@
             </w:hyperlink>
             <w:r>
               <w:rPr>
-                <w:rFonts w:ascii="宋体" w:eastAsia="宋体" w:hAnsi="宋体" w:cstheme="minorHAnsi" w:hint="eastAsia"/>
+                <w:rFonts w:ascii="Times New Roman" w:eastAsia="宋体" w:hAnsi="Times New Roman" w:cstheme="minorHAnsi" w:hint="eastAsia"/>
                 <w:bCs/>
                 <w:sz w:val="20"/>
                 <w:szCs w:val="20"/>
@@ -115,7 +115,7 @@
               <w:r>
                 <w:rPr>
                   <w:rStyle w:val="ab"/>
-                  <w:rFonts w:ascii="宋体" w:eastAsia="宋体" w:hAnsi="宋体" w:cstheme="minorHAnsi"/>
+                  <w:rFonts w:ascii="Times New Roman" w:eastAsia="宋体" w:hAnsi="Times New Roman" w:cstheme="minorHAnsi"/>
                   <w:bCs/>
                   <w:sz w:val="20"/>
                   <w:szCs w:val="20"/>
@@ -141,7 +141,7 @@
           <w:p>
             <w:pPr>
               <w:rPr>
-                <w:rFonts w:cstheme="minorHAnsi"/>
+                <w:rFonts w:ascii="Times New Roman" w:hAnsi="Times New Roman" w:cstheme="minorHAnsi"/>
                 <w:b/>
                 <w:u w:val="single"/>
               </w:rPr>
@@ -164,14 +164,14 @@
           <w:p>
             <w:pPr>
               <w:rPr>
-                <w:rFonts w:cstheme="minorHAnsi"/>
+                <w:rFonts w:ascii="Times New Roman" w:hAnsi="Times New Roman" w:cstheme="minorHAnsi"/>
                 <w:sz w:val="24"/>
                 <w:szCs w:val="24"/>
               </w:rPr>
             </w:pPr>
             <w:r>
               <w:rPr>
-                <w:rFonts w:ascii="黑体" w:eastAsia="黑体" w:hAnsi="黑体" w:cstheme="minorHAnsi" w:hint="eastAsia"/>
+                <w:rFonts w:ascii="Times New Roman" w:eastAsia="黑体" w:hAnsi="Times New Roman" w:cstheme="minorHAnsi" w:hint="eastAsia"/>
                 <w:b/>
                 <w:sz w:val="24"/>
                 <w:szCs w:val="24"/>
@@ -195,7 +195,7 @@
             <w:pPr>
               <w:spacing w:line="276" w:lineRule="auto"/>
               <w:rPr>
-                <w:rFonts w:ascii="黑体" w:eastAsia="黑体" w:hAnsi="黑体" w:cstheme="minorHAnsi" w:hint="eastAsia"/>
+                <w:rFonts w:ascii="Times New Roman" w:eastAsia="黑体" w:hAnsi="Times New Roman" w:cstheme="minorHAnsi" w:hint="eastAsia"/>
                 <w:b/>
                 <w:sz w:val="18"/>
                 <w:szCs w:val="18"/>
@@ -203,7 +203,7 @@
             </w:pPr>
             <w:r>
               <w:rPr>
-                <w:rFonts w:ascii="黑体" w:eastAsia="黑体" w:hAnsi="黑体" w:cstheme="minorHAnsi" w:hint="eastAsia"/>
+                <w:rFonts w:ascii="Times New Roman" w:eastAsia="黑体" w:hAnsi="Times New Roman" w:cstheme="minorHAnsi" w:hint="eastAsia"/>
                 <w:b/>
                 <w:sz w:val="18"/>
                 <w:szCs w:val="18"/>
@@ -224,14 +224,14 @@
             <w:pPr>
               <w:spacing w:line="276" w:lineRule="auto"/>
               <w:rPr>
-                <w:rFonts w:ascii="黑体" w:eastAsia="黑体" w:hAnsi="黑体" w:cstheme="minorHAnsi" w:hint="eastAsia"/>
+                <w:rFonts w:ascii="Times New Roman" w:eastAsia="黑体" w:hAnsi="Times New Roman" w:cstheme="minorHAnsi" w:hint="eastAsia"/>
                 <w:sz w:val="18"/>
                 <w:szCs w:val="18"/>
               </w:rPr>
             </w:pPr>
             <w:r>
               <w:rPr>
-                <w:rFonts w:ascii="黑体" w:eastAsia="黑体" w:hAnsi="黑体" w:cstheme="minorHAnsi" w:hint="eastAsia"/>
+                <w:rFonts w:ascii="Times New Roman" w:eastAsia="黑体" w:hAnsi="Times New Roman" w:cstheme="minorHAnsi" w:hint="eastAsia"/>
                 <w:b/>
                 <w:sz w:val="18"/>
                 <w:szCs w:val="18"/>
@@ -254,14 +254,14 @@
               <w:spacing w:line="276" w:lineRule="auto"/>
               <w:jc w:val="right"/>
               <w:rPr>
-                <w:rFonts w:ascii="黑体" w:eastAsia="黑体" w:hAnsi="黑体" w:cstheme="minorHAnsi" w:hint="eastAsia"/>
+                <w:rFonts w:ascii="Times New Roman" w:eastAsia="黑体" w:hAnsi="Times New Roman" w:cstheme="minorHAnsi" w:hint="eastAsia"/>
                 <w:sz w:val="18"/>
                 <w:szCs w:val="18"/>
               </w:rPr>
             </w:pPr>
             <w:r>
               <w:rPr>
-                <w:rFonts w:ascii="黑体" w:eastAsia="黑体" w:hAnsi="黑体" w:cstheme="minorHAnsi" w:hint="eastAsia"/>
+                <w:rFonts w:ascii="Times New Roman" w:eastAsia="黑体" w:hAnsi="Times New Roman" w:cstheme="minorHAnsi" w:hint="eastAsia"/>
                 <w:b/>
                 <w:sz w:val="18"/>
                 <w:szCs w:val="18"/>
@@ -285,7 +285,7 @@
             <w:pPr>
               <w:spacing w:line="276" w:lineRule="auto"/>
               <w:rPr>
-                <w:rFonts w:ascii="黑体" w:eastAsia="黑体" w:hAnsi="黑体" w:cstheme="minorHAnsi" w:hint="eastAsia"/>
+                <w:rFonts w:ascii="Times New Roman" w:eastAsia="黑体" w:hAnsi="Times New Roman" w:cstheme="minorHAnsi" w:hint="eastAsia"/>
                 <w:b/>
                 <w:sz w:val="18"/>
                 <w:szCs w:val="18"/>
@@ -293,7 +293,7 @@
             </w:pPr>
             <w:r>
               <w:rPr>
-                <w:rFonts w:ascii="黑体" w:eastAsia="黑体" w:hAnsi="黑体" w:cstheme="minorHAnsi" w:hint="eastAsia"/>
+                <w:rFonts w:ascii="Times New Roman" w:eastAsia="黑体" w:hAnsi="Times New Roman" w:cstheme="minorHAnsi" w:hint="eastAsia"/>
                 <w:b/>
                 <w:sz w:val="18"/>
                 <w:szCs w:val="18"/>
@@ -314,7 +314,7 @@
             <w:pPr>
               <w:spacing w:line="276" w:lineRule="auto"/>
               <w:rPr>
-                <w:rFonts w:ascii="黑体" w:eastAsia="黑体" w:hAnsi="黑体" w:cstheme="minorHAnsi" w:hint="eastAsia"/>
+                <w:rFonts w:ascii="Times New Roman" w:eastAsia="黑体" w:hAnsi="Times New Roman" w:cstheme="minorHAnsi" w:hint="eastAsia"/>
                 <w:b/>
                 <w:sz w:val="18"/>
                 <w:szCs w:val="18"/>
@@ -322,7 +322,7 @@
             </w:pPr>
             <w:r>
               <w:rPr>
-                <w:rFonts w:ascii="黑体" w:eastAsia="黑体" w:hAnsi="黑体" w:cstheme="minorHAnsi" w:hint="eastAsia"/>
+                <w:rFonts w:ascii="Times New Roman" w:eastAsia="黑体" w:hAnsi="Times New Roman" w:cstheme="minorHAnsi" w:hint="eastAsia"/>
                 <w:b/>
                 <w:sz w:val="18"/>
                 <w:szCs w:val="18"/>
@@ -345,7 +345,7 @@
               <w:spacing w:line="276" w:lineRule="auto"/>
               <w:jc w:val="right"/>
               <w:rPr>
-                <w:rFonts w:ascii="黑体" w:eastAsia="黑体" w:hAnsi="黑体" w:cstheme="minorHAnsi" w:hint="eastAsia"/>
+                <w:rFonts w:ascii="Times New Roman" w:eastAsia="黑体" w:hAnsi="Times New Roman" w:cstheme="minorHAnsi" w:hint="eastAsia"/>
                 <w:b/>
                 <w:sz w:val="18"/>
                 <w:szCs w:val="18"/>
@@ -353,7 +353,7 @@
             </w:pPr>
             <w:r>
               <w:rPr>
-                <w:rFonts w:ascii="黑体" w:eastAsia="黑体" w:hAnsi="黑体" w:cstheme="minorHAnsi" w:hint="eastAsia"/>
+                <w:rFonts w:ascii="Times New Roman" w:eastAsia="黑体" w:hAnsi="Times New Roman" w:cstheme="minorHAnsi" w:hint="eastAsia"/>
                 <w:b/>
                 <w:sz w:val="18"/>
                 <w:szCs w:val="18"/>
@@ -406,7 +406,7 @@
         </w:tabs>
         <w:spacing w:after="0" w:line="240" w:lineRule="auto"/>
         <w:rPr>
-          <w:rFonts w:cstheme="minorHAnsi"/>
+          <w:rFonts w:ascii="Times New Roman" w:hAnsi="Times New Roman" w:cstheme="minorHAnsi"/>
         </w:rPr>
       </w:pPr>
     </w:p>
@@ -448,14 +448,14 @@
           <w:p>
             <w:pPr>
               <w:rPr>
-                <w:rFonts w:cstheme="minorHAnsi"/>
+                <w:rFonts w:ascii="Times New Roman" w:hAnsi="Times New Roman" w:cstheme="minorHAnsi"/>
                 <w:b/>
                 <w:sz w:val="24"/>
               </w:rPr>
             </w:pPr>
             <w:r>
               <w:rPr>
-                <w:rFonts w:ascii="黑体" w:eastAsia="黑体" w:hAnsi="黑体" w:cstheme="minorHAnsi" w:hint="eastAsia"/>
+                <w:rFonts w:ascii="Times New Roman" w:eastAsia="黑体" w:hAnsi="Times New Roman" w:cstheme="minorHAnsi" w:hint="eastAsia"/>
                 <w:b/>
                 <w:sz w:val="24"/>
                 <w:szCs w:val="24"/>
@@ -489,7 +489,7 @@
           <w:p>
             <w:pPr>
               <w:rPr>
-                <w:rFonts w:ascii="黑体" w:eastAsia="黑体" w:hAnsi="黑体" w:cstheme="minorHAnsi" w:hint="eastAsia"/>
+                <w:rFonts w:ascii="Times New Roman" w:eastAsia="黑体" w:hAnsi="Times New Roman" w:cstheme="minorHAnsi" w:hint="eastAsia"/>
                 <w:b/>
                 <w:sz w:val="18"/>
                 <w:szCs w:val="18"/>
@@ -497,7 +497,7 @@
             </w:pPr>
             <w:r>
               <w:rPr>
-                <w:rFonts w:ascii="黑体" w:eastAsia="黑体" w:hAnsi="黑体" w:cstheme="minorHAnsi" w:hint="eastAsia"/>
+                <w:rFonts w:ascii="Times New Roman" w:eastAsia="黑体" w:hAnsi="Times New Roman" w:cstheme="minorHAnsi" w:hint="eastAsia"/>
                 <w:b/>
                 <w:sz w:val="18"/>
                 <w:szCs w:val="18"/>
@@ -520,20 +520,31 @@
           <w:p>
             <w:pPr>
               <w:rPr>
-                <w:rFonts w:ascii="黑体" w:eastAsia="黑体" w:hAnsi="黑体" w:cstheme="minorHAnsi" w:hint="eastAsia"/>
+                <w:rFonts w:ascii="Times New Roman" w:eastAsia="黑体" w:hAnsi="Times New Roman" w:cstheme="minorHAnsi" w:hint="eastAsia"/>
                 <w:b/>
                 <w:sz w:val="18"/>
                 <w:szCs w:val="18"/>
               </w:rPr>
             </w:pPr>
-            <w:r>
-              <w:rPr>
-                <w:rFonts w:ascii="黑体" w:eastAsia="黑体" w:hAnsi="黑体" w:cstheme="minorHAnsi" w:hint="eastAsia"/>
+            <w:proofErr w:type="spellStart"/>
+            <w:r>
+              <w:rPr>
+                <w:rFonts w:ascii="Times New Roman" w:eastAsia="黑体" w:hAnsi="Times New Roman" w:cstheme="minorHAnsi" w:hint="eastAsia"/>
                 <w:b/>
                 <w:sz w:val="18"/>
                 <w:szCs w:val="18"/>
               </w:rPr>
-              <w:t>Ubiquant Investment - AI Lab</w:t>
+              <w:t>Ubiquant</w:t>
+            </w:r>
+            <w:proofErr w:type="spellEnd"/>
+            <w:r>
+              <w:rPr>
+                <w:rFonts w:ascii="Times New Roman" w:eastAsia="黑体" w:hAnsi="Times New Roman" w:cstheme="minorHAnsi" w:hint="eastAsia"/>
+                <w:b/>
+                <w:sz w:val="18"/>
+                <w:szCs w:val="18"/>
+              </w:rPr>
+              <w:t xml:space="preserve"> Investment - AI Lab</w:t>
             </w:r>
           </w:p>
         </w:tc>
@@ -551,7 +562,7 @@
           <w:p>
             <w:pPr>
               <w:rPr>
-                <w:rFonts w:ascii="黑体" w:eastAsia="黑体" w:hAnsi="黑体" w:cstheme="minorHAnsi" w:hint="eastAsia"/>
+                <w:rFonts w:ascii="Times New Roman" w:eastAsia="黑体" w:hAnsi="Times New Roman" w:cstheme="minorHAnsi" w:hint="eastAsia"/>
                 <w:b/>
                 <w:sz w:val="18"/>
                 <w:szCs w:val="18"/>
@@ -559,7 +570,7 @@
             </w:pPr>
             <w:r>
               <w:rPr>
-                <w:rFonts w:ascii="黑体" w:eastAsia="黑体" w:hAnsi="黑体" w:cstheme="minorHAnsi" w:hint="eastAsia"/>
+                <w:rFonts w:ascii="Times New Roman" w:eastAsia="黑体" w:hAnsi="Times New Roman" w:cstheme="minorHAnsi" w:hint="eastAsia"/>
                 <w:b/>
                 <w:sz w:val="18"/>
                 <w:szCs w:val="18"/>
@@ -607,18 +618,83 @@
                 <w:color w:val="auto"/>
               </w:rPr>
             </w:pPr>
-            <w:r>
-              <w:rPr>
-                <w:b/>
-                <w:bCs/>
-              </w:rPr>
-              <w:t>FlashInfer CUDA Graph reliability:</w:t>
-            </w:r>
-            <w:r>
-              <w:rPr>
-                <w:bCs/>
-              </w:rPr>
-              <w:t xml:space="preserve"> Reproduced a vLLM TP=2 rollout hang on H200 and traced it to FTZ making a floating-point check misclassify valid negative subnormal FP32 values as the Lamport -0.0 sentinel in fused AllReduce + RMSNorm polling. Switched to an exact 0x80000000 bit check; two-GPU and model graph on/off regressions passed with no further hangs.</w:t>
+            <w:proofErr w:type="spellStart"/>
+            <w:r>
+              <w:rPr>
+                <w:b/>
+                <w:bCs/>
+              </w:rPr>
+              <w:t>FlashInfer</w:t>
+            </w:r>
+            <w:proofErr w:type="spellEnd"/>
+            <w:r>
+              <w:rPr>
+                <w:b/>
+                <w:bCs/>
+              </w:rPr>
+              <w:t xml:space="preserve"> CUDA Graph reliability:</w:t>
+            </w:r>
+            <w:r>
+              <w:rPr>
+                <w:bCs/>
+              </w:rPr>
+              <w:t xml:space="preserve"> Reproduced a </w:t>
+            </w:r>
+            <w:proofErr w:type="spellStart"/>
+            <w:r>
+              <w:rPr>
+                <w:bCs/>
+              </w:rPr>
+              <w:t>vLLM</w:t>
+            </w:r>
+            <w:proofErr w:type="spellEnd"/>
+            <w:r>
+              <w:rPr>
+                <w:bCs/>
+              </w:rPr>
+              <w:t xml:space="preserve"> TP=2 rollout </w:t>
+            </w:r>
+            <w:proofErr w:type="gramStart"/>
+            <w:r>
+              <w:rPr>
+                <w:bCs/>
+              </w:rPr>
+              <w:t>hang</w:t>
+            </w:r>
+            <w:proofErr w:type="gramEnd"/>
+            <w:r>
+              <w:rPr>
+                <w:bCs/>
+              </w:rPr>
+              <w:t xml:space="preserve"> on H200 and traced it to FTZ making a floating-point check misclassify valid negative subnormal FP32 values as the Lamport -0.0 sentinel in fused </w:t>
+            </w:r>
+            <w:proofErr w:type="spellStart"/>
+            <w:r>
+              <w:rPr>
+                <w:bCs/>
+              </w:rPr>
+              <w:t>AllReduce</w:t>
+            </w:r>
+            <w:proofErr w:type="spellEnd"/>
+            <w:r>
+              <w:rPr>
+                <w:bCs/>
+              </w:rPr>
+              <w:t xml:space="preserve"> + </w:t>
+            </w:r>
+            <w:proofErr w:type="spellStart"/>
+            <w:r>
+              <w:rPr>
+                <w:bCs/>
+              </w:rPr>
+              <w:t>RMSNorm</w:t>
+            </w:r>
+            <w:proofErr w:type="spellEnd"/>
+            <w:r>
+              <w:rPr>
+                <w:bCs/>
+              </w:rPr>
+              <w:t xml:space="preserve"> polling. Switched to an exact 0x80000000 bit check; two-GPU and model graph on/off regressions passed with no further hangs.</w:t>
             </w:r>
           </w:p>
           <w:p>
@@ -654,12 +730,23 @@
               <w:t>R3 Router Replay:</w:t>
             </w:r>
             <w:r>
-              <w:t xml:space="preserve"> Built route capture, transport, and replay between vLLM and Megatron with response-mask alignment and 18 CPU tests. On 8xH200/Qwen3-30B-A3B, reduced route mismatch from 17-19% to 0, F-tau2 by 36-145x, and KL by 4-7x; scaled the workflow to 128 GPUs for a 200-step internal 300B run.</w:t>
+              <w:t xml:space="preserve"> Built route capture, transport, and replay between </w:t>
+            </w:r>
+            <w:proofErr w:type="spellStart"/>
+            <w:r>
+              <w:t>vLLM</w:t>
+            </w:r>
+            <w:proofErr w:type="spellEnd"/>
+            <w:r>
+              <w:t xml:space="preserve"> and Megatron with response-mask alignment and 18 CPU tests. On 8xH200/Qwen3-30B-A3B, reduced route mismatch from 17-19% to 0, F-tau2 by 36-145x, and KL by 4-7x; scaled the workflow to 128 GPUs for a 200-step internal 300B run.</w:t>
             </w:r>
           </w:p>
           <w:p>
             <w:pPr>
               <w:pStyle w:val="a5"/>
+              <w:rPr>
+                <w:rFonts w:ascii="Times New Roman" w:hAnsi="Times New Roman"/>
+              </w:rPr>
             </w:pPr>
           </w:p>
           <w:p>
@@ -682,7 +769,35 @@
               <w:rPr>
                 <w:bCs/>
               </w:rPr>
-              <w:t xml:space="preserve"> Added Triton full-K and DeepGEMM SM90 BF16 paths for decode-time small-M workloads. Across 20 model scenarios, DeepGEMM reduced median latency for 48 router GEMMs from 789.23 to 210.01 us/step (-73.39%) and total GPU busy time by 6.16%, with 135/135 kernel and 20/20 bitwise model checks passing.</w:t>
+              <w:t xml:space="preserve"> Added Triton full-K and </w:t>
+            </w:r>
+            <w:proofErr w:type="spellStart"/>
+            <w:r>
+              <w:rPr>
+                <w:bCs/>
+              </w:rPr>
+              <w:t>DeepGEMM</w:t>
+            </w:r>
+            <w:proofErr w:type="spellEnd"/>
+            <w:r>
+              <w:rPr>
+                <w:bCs/>
+              </w:rPr>
+              <w:t xml:space="preserve"> SM90 BF16 paths for decode-time small-M workloads. Across 20 model scenarios, </w:t>
+            </w:r>
+            <w:proofErr w:type="spellStart"/>
+            <w:r>
+              <w:rPr>
+                <w:bCs/>
+              </w:rPr>
+              <w:t>DeepGEMM</w:t>
+            </w:r>
+            <w:proofErr w:type="spellEnd"/>
+            <w:r>
+              <w:rPr>
+                <w:bCs/>
+              </w:rPr>
+              <w:t xml:space="preserve"> reduced median latency for 48 router GEMMs from 789.23 to 210.01 us/step (-73.39%) and total GPU busy time by 6.16%, with 135/135 kernel and 20/20 bitwise model checks passing.</w:t>
             </w:r>
           </w:p>
           <w:p>
@@ -784,10 +899,13 @@
                   <w:pPr>
                     <w:keepNext/>
                     <w:spacing w:after="0"/>
+                    <w:rPr>
+                      <w:rFonts w:ascii="Times New Roman" w:hAnsi="Times New Roman"/>
+                    </w:rPr>
                   </w:pPr>
                   <w:r>
                     <w:rPr>
-                      <w:rFonts w:ascii="黑体" w:eastAsia="黑体" w:hAnsi="黑体" w:cstheme="minorHAnsi" w:hint="eastAsia"/>
+                      <w:rFonts w:ascii="Times New Roman" w:eastAsia="黑体" w:hAnsi="Times New Roman" w:cstheme="minorHAnsi" w:hint="eastAsia"/>
                       <w:b/>
                       <w:sz w:val="18"/>
                       <w:szCs w:val="18"/>
@@ -817,7 +935,7 @@
                     <w:keepNext/>
                     <w:spacing w:after="0"/>
                     <w:rPr>
-                      <w:rFonts w:ascii="黑体" w:eastAsia="黑体" w:hAnsi="黑体" w:cstheme="minorHAnsi" w:hint="eastAsia"/>
+                      <w:rFonts w:ascii="Times New Roman" w:eastAsia="黑体" w:hAnsi="Times New Roman" w:cstheme="minorHAnsi" w:hint="eastAsia"/>
                       <w:b/>
                       <w:sz w:val="18"/>
                       <w:szCs w:val="18"/>
@@ -825,7 +943,7 @@
                   </w:pPr>
                   <w:r>
                     <w:rPr>
-                      <w:rFonts w:ascii="黑体" w:eastAsia="黑体" w:hAnsi="黑体" w:cstheme="minorHAnsi" w:hint="eastAsia"/>
+                      <w:rFonts w:ascii="Times New Roman" w:eastAsia="黑体" w:hAnsi="Times New Roman" w:cstheme="minorHAnsi" w:hint="eastAsia"/>
                       <w:b/>
                       <w:sz w:val="18"/>
                       <w:szCs w:val="18"/>
@@ -854,10 +972,13 @@
                   <w:pPr>
                     <w:spacing w:after="0"/>
                     <w:jc w:val="right"/>
+                    <w:rPr>
+                      <w:rFonts w:ascii="Times New Roman" w:hAnsi="Times New Roman"/>
+                    </w:rPr>
                   </w:pPr>
                   <w:r>
                     <w:rPr>
-                      <w:rFonts w:ascii="黑体" w:eastAsia="黑体" w:hAnsi="黑体" w:cstheme="minorHAnsi" w:hint="eastAsia"/>
+                      <w:rFonts w:ascii="Times New Roman" w:eastAsia="黑体" w:hAnsi="Times New Roman" w:cstheme="minorHAnsi" w:hint="eastAsia"/>
                       <w:b/>
                       <w:sz w:val="18"/>
                       <w:szCs w:val="18"/>
@@ -899,7 +1020,27 @@
                 <w:sz w:val="20"/>
                 <w:szCs w:val="20"/>
               </w:rPr>
-              <w:t xml:space="preserve"> Added operator support, plugin integration, tests, and graph optimizations. Integrated muDNN GELU and fixed the fusion pipeline so all 11 GELUs in the target network were fused, cutting representative-shape latency by 36.6%.</w:t>
+              <w:t xml:space="preserve"> Added operator support, plugin integration, tests, and graph optimizations. Integrated </w:t>
+            </w:r>
+            <w:proofErr w:type="spellStart"/>
+            <w:r>
+              <w:rPr>
+                <w:rFonts w:ascii="Times New Roman" w:eastAsia="宋体" w:hAnsi="Times New Roman" w:cstheme="minorHAnsi"/>
+                <w:bCs/>
+                <w:sz w:val="20"/>
+                <w:szCs w:val="20"/>
+              </w:rPr>
+              <w:t>muDNN</w:t>
+            </w:r>
+            <w:proofErr w:type="spellEnd"/>
+            <w:r>
+              <w:rPr>
+                <w:rFonts w:ascii="Times New Roman" w:eastAsia="宋体" w:hAnsi="Times New Roman" w:cstheme="minorHAnsi"/>
+                <w:bCs/>
+                <w:sz w:val="20"/>
+                <w:szCs w:val="20"/>
+              </w:rPr>
+              <w:t xml:space="preserve"> GELU and fixed the fusion pipeline so all 11 GELUs in the target network were fused, cutting representative-shape latency by 36.6%.</w:t>
             </w:r>
           </w:p>
           <w:p>
@@ -945,7 +1086,47 @@
                 <w:sz w:val="20"/>
                 <w:szCs w:val="20"/>
               </w:rPr>
-              <w:t xml:space="preserve"> Traced long-run failures to shape tensors entering the device path in StridedSlice&lt;int32&gt;/Pack&lt;int32&gt;. Reworked HostMemory handling, improving success from about 30% at 500 iterations to 100% at 1,000 and passing 40K/400K/800K-iteration stress runs.</w:t>
+              <w:t xml:space="preserve"> Traced long-run failures to shape tensors entering the device path in </w:t>
+            </w:r>
+            <w:proofErr w:type="spellStart"/>
+            <w:r>
+              <w:rPr>
+                <w:rFonts w:ascii="Times New Roman" w:eastAsia="宋体" w:hAnsi="Times New Roman" w:cstheme="minorHAnsi"/>
+                <w:bCs/>
+                <w:sz w:val="20"/>
+                <w:szCs w:val="20"/>
+              </w:rPr>
+              <w:t>StridedSlice</w:t>
+            </w:r>
+            <w:proofErr w:type="spellEnd"/>
+            <w:r>
+              <w:rPr>
+                <w:rFonts w:ascii="Times New Roman" w:eastAsia="宋体" w:hAnsi="Times New Roman" w:cstheme="minorHAnsi"/>
+                <w:bCs/>
+                <w:sz w:val="20"/>
+                <w:szCs w:val="20"/>
+              </w:rPr>
+              <w:t xml:space="preserve">&lt;int32&gt;/Pack&lt;int32&gt;. Reworked </w:t>
+            </w:r>
+            <w:proofErr w:type="spellStart"/>
+            <w:r>
+              <w:rPr>
+                <w:rFonts w:ascii="Times New Roman" w:eastAsia="宋体" w:hAnsi="Times New Roman" w:cstheme="minorHAnsi"/>
+                <w:bCs/>
+                <w:sz w:val="20"/>
+                <w:szCs w:val="20"/>
+              </w:rPr>
+              <w:t>HostMemory</w:t>
+            </w:r>
+            <w:proofErr w:type="spellEnd"/>
+            <w:r>
+              <w:rPr>
+                <w:rFonts w:ascii="Times New Roman" w:eastAsia="宋体" w:hAnsi="Times New Roman" w:cstheme="minorHAnsi"/>
+                <w:bCs/>
+                <w:sz w:val="20"/>
+                <w:szCs w:val="20"/>
+              </w:rPr>
+              <w:t xml:space="preserve"> handling, improving success from about 30% at 500 iterations to 100% at 1,000 and passing 40K/400K/800K-iteration stress runs.</w:t>
             </w:r>
           </w:p>
           <w:p>
@@ -982,14 +1163,14 @@
           <w:p>
             <w:pPr>
               <w:rPr>
-                <w:rFonts w:cstheme="minorHAnsi"/>
+                <w:rFonts w:ascii="Times New Roman" w:hAnsi="Times New Roman" w:cstheme="minorHAnsi"/>
                 <w:b/>
                 <w:sz w:val="24"/>
               </w:rPr>
             </w:pPr>
             <w:r>
               <w:rPr>
-                <w:rFonts w:ascii="黑体" w:eastAsia="黑体" w:hAnsi="黑体" w:cstheme="minorHAnsi" w:hint="eastAsia"/>
+                <w:rFonts w:ascii="Times New Roman" w:eastAsia="黑体" w:hAnsi="Times New Roman" w:cstheme="minorHAnsi" w:hint="eastAsia"/>
                 <w:b/>
                 <w:sz w:val="24"/>
                 <w:szCs w:val="24"/>
@@ -1020,7 +1201,7 @@
           <w:p>
             <w:pPr>
               <w:rPr>
-                <w:rFonts w:ascii="黑体" w:eastAsia="黑体" w:hAnsi="黑体" w:cstheme="minorHAnsi" w:hint="eastAsia"/>
+                <w:rFonts w:ascii="Times New Roman" w:eastAsia="黑体" w:hAnsi="Times New Roman" w:cstheme="minorHAnsi" w:hint="eastAsia"/>
                 <w:b/>
                 <w:sz w:val="18"/>
                 <w:szCs w:val="18"/>
@@ -1028,7 +1209,7 @@
             </w:pPr>
             <w:r>
               <w:rPr>
-                <w:rFonts w:ascii="黑体" w:eastAsia="黑体" w:hAnsi="黑体" w:cstheme="minorHAnsi" w:hint="eastAsia"/>
+                <w:rFonts w:ascii="Times New Roman" w:eastAsia="黑体" w:hAnsi="Times New Roman" w:cstheme="minorHAnsi" w:hint="eastAsia"/>
                 <w:b/>
                 <w:sz w:val="18"/>
                 <w:szCs w:val="18"/>
@@ -1054,7 +1235,7 @@
             <w:pPr>
               <w:jc w:val="center"/>
               <w:rPr>
-                <w:rFonts w:ascii="黑体" w:eastAsia="黑体" w:hAnsi="黑体" w:cstheme="minorHAnsi" w:hint="eastAsia"/>
+                <w:rFonts w:ascii="Times New Roman" w:eastAsia="黑体" w:hAnsi="Times New Roman" w:cstheme="minorHAnsi" w:hint="eastAsia"/>
                 <w:sz w:val="18"/>
                 <w:szCs w:val="18"/>
               </w:rPr>
@@ -1080,7 +1261,7 @@
               <w:wordWrap w:val="0"/>
               <w:jc w:val="right"/>
               <w:rPr>
-                <w:rFonts w:ascii="黑体" w:eastAsia="黑体" w:hAnsi="黑体" w:cstheme="minorHAnsi" w:hint="eastAsia"/>
+                <w:rFonts w:ascii="Times New Roman" w:eastAsia="黑体" w:hAnsi="Times New Roman" w:cstheme="minorHAnsi" w:hint="eastAsia"/>
                 <w:b/>
                 <w:sz w:val="18"/>
                 <w:szCs w:val="18"/>
@@ -1088,7 +1269,7 @@
             </w:pPr>
             <w:r>
               <w:rPr>
-                <w:rFonts w:ascii="黑体" w:eastAsia="黑体" w:hAnsi="黑体" w:cstheme="minorHAnsi" w:hint="eastAsia"/>
+                <w:rFonts w:ascii="Times New Roman" w:eastAsia="黑体" w:hAnsi="Times New Roman" w:cstheme="minorHAnsi" w:hint="eastAsia"/>
                 <w:b/>
                 <w:bCs/>
                 <w:sz w:val="18"/>
@@ -1163,7 +1344,21 @@
               <w:rPr>
                 <w:lang w:eastAsia="zh-CN"/>
               </w:rPr>
-              <w:t xml:space="preserve"> (Merged): Fixed transfer stalls and timeouts caused by reusing stale QPs after RDMA port recovery. Reordered storage writes to call fdatasync before metadata commit and added regression coverage for sync failures and orphan-file cleanup.</w:t>
+              <w:t xml:space="preserve"> (Merged): Fixed transfer stalls and timeouts caused by reusing stale QPs after RDMA port recovery. Reordered storage writes to call </w:t>
+            </w:r>
+            <w:proofErr w:type="spellStart"/>
+            <w:r>
+              <w:rPr>
+                <w:lang w:eastAsia="zh-CN"/>
+              </w:rPr>
+              <w:t>fdatasync</w:t>
+            </w:r>
+            <w:proofErr w:type="spellEnd"/>
+            <w:r>
+              <w:rPr>
+                <w:lang w:eastAsia="zh-CN"/>
+              </w:rPr>
+              <w:t xml:space="preserve"> before metadata commit and added regression coverage for sync failures and orphan-file cleanup.</w:t>
             </w:r>
           </w:p>
         </w:tc>
@@ -1185,14 +1380,14 @@
             <w:pPr>
               <w:pageBreakBefore/>
               <w:rPr>
-                <w:rFonts w:cstheme="minorHAnsi"/>
+                <w:rFonts w:ascii="Times New Roman" w:hAnsi="Times New Roman" w:cstheme="minorHAnsi"/>
                 <w:b/>
                 <w:sz w:val="24"/>
               </w:rPr>
             </w:pPr>
             <w:r>
               <w:rPr>
-                <w:rFonts w:ascii="黑体" w:eastAsia="黑体" w:hAnsi="黑体" w:cstheme="minorHAnsi" w:hint="eastAsia"/>
+                <w:rFonts w:ascii="Times New Roman" w:eastAsia="黑体" w:hAnsi="Times New Roman" w:cstheme="minorHAnsi" w:hint="eastAsia"/>
                 <w:b/>
                 <w:sz w:val="24"/>
                 <w:szCs w:val="24"/>
@@ -1218,7 +1413,7 @@
           <w:p>
             <w:pPr>
               <w:rPr>
-                <w:rFonts w:ascii="黑体" w:eastAsia="黑体" w:hAnsi="黑体" w:cstheme="minorHAnsi" w:hint="eastAsia"/>
+                <w:rFonts w:ascii="Times New Roman" w:eastAsia="黑体" w:hAnsi="Times New Roman" w:cstheme="minorHAnsi" w:hint="eastAsia"/>
                 <w:b/>
                 <w:sz w:val="18"/>
                 <w:szCs w:val="18"/>
@@ -1226,7 +1421,7 @@
             </w:pPr>
             <w:r>
               <w:rPr>
-                <w:rFonts w:ascii="黑体" w:eastAsia="黑体" w:hAnsi="黑体" w:cstheme="minorHAnsi" w:hint="eastAsia"/>
+                <w:rFonts w:ascii="Times New Roman" w:eastAsia="黑体" w:hAnsi="Times New Roman" w:cstheme="minorHAnsi" w:hint="eastAsia"/>
                 <w:b/>
                 <w:sz w:val="18"/>
                 <w:szCs w:val="18"/>
@@ -1246,7 +1441,7 @@
             <w:pPr>
               <w:jc w:val="center"/>
               <w:rPr>
-                <w:rFonts w:ascii="黑体" w:eastAsia="黑体" w:hAnsi="黑体" w:cstheme="minorHAnsi" w:hint="eastAsia"/>
+                <w:rFonts w:ascii="Times New Roman" w:eastAsia="黑体" w:hAnsi="Times New Roman" w:cstheme="minorHAnsi" w:hint="eastAsia"/>
                 <w:sz w:val="18"/>
                 <w:szCs w:val="18"/>
               </w:rPr>
@@ -1266,7 +1461,7 @@
               <w:wordWrap w:val="0"/>
               <w:jc w:val="right"/>
               <w:rPr>
-                <w:rFonts w:ascii="黑体" w:eastAsia="黑体" w:hAnsi="黑体" w:cstheme="minorHAnsi" w:hint="eastAsia"/>
+                <w:rFonts w:ascii="Times New Roman" w:eastAsia="黑体" w:hAnsi="Times New Roman" w:cstheme="minorHAnsi" w:hint="eastAsia"/>
                 <w:b/>
                 <w:sz w:val="18"/>
                 <w:szCs w:val="18"/>
@@ -1274,13 +1469,35 @@
             </w:pPr>
             <w:r>
               <w:rPr>
-                <w:rFonts w:ascii="黑体" w:eastAsia="黑体" w:hAnsi="黑体" w:cstheme="minorHAnsi" w:hint="eastAsia"/>
+                <w:rFonts w:ascii="Times New Roman" w:eastAsia="黑体" w:hAnsi="Times New Roman" w:cstheme="minorHAnsi" w:hint="eastAsia"/>
                 <w:b/>
                 <w:bCs/>
                 <w:sz w:val="18"/>
                 <w:szCs w:val="18"/>
               </w:rPr>
-              <w:t>High-Performance Quantized LLM Runtime with PyTorch Extensions</w:t>
+              <w:t xml:space="preserve">High-Performance Quantized LLM Runtime with </w:t>
+            </w:r>
+            <w:proofErr w:type="spellStart"/>
+            <w:r>
+              <w:rPr>
+                <w:rFonts w:ascii="Times New Roman" w:eastAsia="黑体" w:hAnsi="Times New Roman" w:cstheme="minorHAnsi" w:hint="eastAsia"/>
+                <w:b/>
+                <w:bCs/>
+                <w:sz w:val="18"/>
+                <w:szCs w:val="18"/>
+              </w:rPr>
+              <w:t>PyTorch</w:t>
+            </w:r>
+            <w:proofErr w:type="spellEnd"/>
+            <w:r>
+              <w:rPr>
+                <w:rFonts w:ascii="Times New Roman" w:eastAsia="黑体" w:hAnsi="Times New Roman" w:cstheme="minorHAnsi" w:hint="eastAsia"/>
+                <w:b/>
+                <w:bCs/>
+                <w:sz w:val="18"/>
+                <w:szCs w:val="18"/>
+              </w:rPr>
+              <w:t xml:space="preserve"> Extensions</w:t>
             </w:r>
           </w:p>
         </w:tc>
@@ -1331,7 +1548,51 @@
                 <w:szCs w:val="20"/>
                 <w:lang w:eastAsia="zh-CN"/>
               </w:rPr>
-              <w:t xml:space="preserve"> Extended a PyTorch runtime supporting W4A16 AWQ, W8A8 SmoothQuant, and FP8 with configurable FlashAttention-2/4, GQA KV-head expansion, soft-cap masking, and an SDPA fallback. Made CUDA architecture, cache, and model paths configurable for local RTX 5060 and H200 deployment.</w:t>
+              <w:t xml:space="preserve"> Extended a </w:t>
+            </w:r>
+            <w:proofErr w:type="spellStart"/>
+            <w:r>
+              <w:rPr>
+                <w:rFonts w:cstheme="minorHAnsi"/>
+                <w:bCs/>
+                <w:color w:val="auto"/>
+                <w:szCs w:val="20"/>
+                <w:lang w:eastAsia="zh-CN"/>
+              </w:rPr>
+              <w:t>PyTorch</w:t>
+            </w:r>
+            <w:proofErr w:type="spellEnd"/>
+            <w:r>
+              <w:rPr>
+                <w:rFonts w:cstheme="minorHAnsi"/>
+                <w:bCs/>
+                <w:color w:val="auto"/>
+                <w:szCs w:val="20"/>
+                <w:lang w:eastAsia="zh-CN"/>
+              </w:rPr>
+              <w:t xml:space="preserve"> runtime supporting W4A16 AWQ, W8A8 </w:t>
+            </w:r>
+            <w:proofErr w:type="spellStart"/>
+            <w:r>
+              <w:rPr>
+                <w:rFonts w:cstheme="minorHAnsi"/>
+                <w:bCs/>
+                <w:color w:val="auto"/>
+                <w:szCs w:val="20"/>
+                <w:lang w:eastAsia="zh-CN"/>
+              </w:rPr>
+              <w:t>SmoothQuant</w:t>
+            </w:r>
+            <w:proofErr w:type="spellEnd"/>
+            <w:r>
+              <w:rPr>
+                <w:rFonts w:cstheme="minorHAnsi"/>
+                <w:bCs/>
+                <w:color w:val="auto"/>
+                <w:szCs w:val="20"/>
+                <w:lang w:eastAsia="zh-CN"/>
+              </w:rPr>
+              <w:t>, and FP8 with configurable FlashAttention-2/4, GQA KV-head expansion, soft-cap masking, and an SDPA fallback. Made CUDA architecture, cache, and model paths configurable for local RTX 5060 and H200 deployment.</w:t>
             </w:r>
           </w:p>
           <w:p>
@@ -1370,7 +1631,117 @@
                 <w:szCs w:val="20"/>
                 <w:lang w:eastAsia="zh-CN"/>
               </w:rPr>
-              <w:t xml:space="preserve"> Ported AWQ to 2xH200 and used Compute Sanitizer to trace an out-of-bounds decode access in gemv_kernel_g128 to reading eight scale/zero groups when K/group_size=7. Added bounds checks, current-stream launches, and error handling; all memcheck/initcheck/synccheck/racecheck cases passed. Implemented packed-AWQ TP=2 with Q/K/V and gate/up column sharding, O/down row sharding, and NCCL all-reduce.</w:t>
+              <w:t xml:space="preserve"> Ported AWQ to 2xH200 and used Compute Sanitizer to trace an out-of-bounds decode access in gemv_kernel_g128 to reading eight scale/zero groups when K/</w:t>
+            </w:r>
+            <w:proofErr w:type="spellStart"/>
+            <w:r>
+              <w:rPr>
+                <w:rFonts w:cstheme="minorHAnsi"/>
+                <w:bCs/>
+                <w:color w:val="auto"/>
+                <w:szCs w:val="20"/>
+                <w:lang w:eastAsia="zh-CN"/>
+              </w:rPr>
+              <w:t>group_size</w:t>
+            </w:r>
+            <w:proofErr w:type="spellEnd"/>
+            <w:r>
+              <w:rPr>
+                <w:rFonts w:cstheme="minorHAnsi"/>
+                <w:bCs/>
+                <w:color w:val="auto"/>
+                <w:szCs w:val="20"/>
+                <w:lang w:eastAsia="zh-CN"/>
+              </w:rPr>
+              <w:t xml:space="preserve">=7. Added bounds checks, current-stream launches, and error handling; all </w:t>
+            </w:r>
+            <w:proofErr w:type="spellStart"/>
+            <w:r>
+              <w:rPr>
+                <w:rFonts w:cstheme="minorHAnsi"/>
+                <w:bCs/>
+                <w:color w:val="auto"/>
+                <w:szCs w:val="20"/>
+                <w:lang w:eastAsia="zh-CN"/>
+              </w:rPr>
+              <w:t>memcheck</w:t>
+            </w:r>
+            <w:proofErr w:type="spellEnd"/>
+            <w:r>
+              <w:rPr>
+                <w:rFonts w:cstheme="minorHAnsi"/>
+                <w:bCs/>
+                <w:color w:val="auto"/>
+                <w:szCs w:val="20"/>
+                <w:lang w:eastAsia="zh-CN"/>
+              </w:rPr>
+              <w:t>/</w:t>
+            </w:r>
+            <w:proofErr w:type="spellStart"/>
+            <w:r>
+              <w:rPr>
+                <w:rFonts w:cstheme="minorHAnsi"/>
+                <w:bCs/>
+                <w:color w:val="auto"/>
+                <w:szCs w:val="20"/>
+                <w:lang w:eastAsia="zh-CN"/>
+              </w:rPr>
+              <w:t>initcheck</w:t>
+            </w:r>
+            <w:proofErr w:type="spellEnd"/>
+            <w:r>
+              <w:rPr>
+                <w:rFonts w:cstheme="minorHAnsi"/>
+                <w:bCs/>
+                <w:color w:val="auto"/>
+                <w:szCs w:val="20"/>
+                <w:lang w:eastAsia="zh-CN"/>
+              </w:rPr>
+              <w:t>/</w:t>
+            </w:r>
+            <w:proofErr w:type="spellStart"/>
+            <w:r>
+              <w:rPr>
+                <w:rFonts w:cstheme="minorHAnsi"/>
+                <w:bCs/>
+                <w:color w:val="auto"/>
+                <w:szCs w:val="20"/>
+                <w:lang w:eastAsia="zh-CN"/>
+              </w:rPr>
+              <w:t>synccheck</w:t>
+            </w:r>
+            <w:proofErr w:type="spellEnd"/>
+            <w:r>
+              <w:rPr>
+                <w:rFonts w:cstheme="minorHAnsi"/>
+                <w:bCs/>
+                <w:color w:val="auto"/>
+                <w:szCs w:val="20"/>
+                <w:lang w:eastAsia="zh-CN"/>
+              </w:rPr>
+              <w:t>/</w:t>
+            </w:r>
+            <w:proofErr w:type="spellStart"/>
+            <w:r>
+              <w:rPr>
+                <w:rFonts w:cstheme="minorHAnsi"/>
+                <w:bCs/>
+                <w:color w:val="auto"/>
+                <w:szCs w:val="20"/>
+                <w:lang w:eastAsia="zh-CN"/>
+              </w:rPr>
+              <w:t>racecheck</w:t>
+            </w:r>
+            <w:proofErr w:type="spellEnd"/>
+            <w:r>
+              <w:rPr>
+                <w:rFonts w:cstheme="minorHAnsi"/>
+                <w:bCs/>
+                <w:color w:val="auto"/>
+                <w:szCs w:val="20"/>
+                <w:lang w:eastAsia="zh-CN"/>
+              </w:rPr>
+              <w:t xml:space="preserve"> cases passed. Implemented packed-AWQ TP=2 with Q/K/V and gate/up column sharding, O/down row sharding, and NCCL all-reduce.</w:t>
             </w:r>
           </w:p>
           <w:p>
@@ -1404,7 +1775,51 @@
                 <w:szCs w:val="20"/>
                 <w:lang w:eastAsia="zh-CN"/>
               </w:rPr>
-              <w:t xml:space="preserve"> Quantized and deployed Qwen2.5-Coder-32B W4A16 on two GPUs. Reduced checkpoint size from 61.04 to 18.02 GiB (-70.5%), increased end-to-end output throughput from 2.53 to 4.47 tok/s (+76.8%), and cut peak memory from 32.02 to 10.63 GiB/rank (-66.8%). Validated with ten CUDA/PyTorch numerical cases, cross-rank token parity, and interactive prompts.</w:t>
+              <w:t xml:space="preserve"> Quantized and deployed Qwen2.5-Coder-32B W4A16 on two GPUs. Reduced checkpoint size from 61.04 to 18.02 GiB (-70.5%), increased end-to-end output throughput from 2.53 to 4.47 </w:t>
+            </w:r>
+            <w:proofErr w:type="spellStart"/>
+            <w:r>
+              <w:rPr>
+                <w:rFonts w:cstheme="minorHAnsi"/>
+                <w:bCs/>
+                <w:color w:val="auto"/>
+                <w:szCs w:val="20"/>
+                <w:lang w:eastAsia="zh-CN"/>
+              </w:rPr>
+              <w:t>tok</w:t>
+            </w:r>
+            <w:proofErr w:type="spellEnd"/>
+            <w:r>
+              <w:rPr>
+                <w:rFonts w:cstheme="minorHAnsi"/>
+                <w:bCs/>
+                <w:color w:val="auto"/>
+                <w:szCs w:val="20"/>
+                <w:lang w:eastAsia="zh-CN"/>
+              </w:rPr>
+              <w:t>/s (+76.8%), and cut peak memory from 32.02 to 10.63 GiB/rank (-66.8%). Validated with ten CUDA/</w:t>
+            </w:r>
+            <w:proofErr w:type="spellStart"/>
+            <w:r>
+              <w:rPr>
+                <w:rFonts w:cstheme="minorHAnsi"/>
+                <w:bCs/>
+                <w:color w:val="auto"/>
+                <w:szCs w:val="20"/>
+                <w:lang w:eastAsia="zh-CN"/>
+              </w:rPr>
+              <w:t>PyTorch</w:t>
+            </w:r>
+            <w:proofErr w:type="spellEnd"/>
+            <w:r>
+              <w:rPr>
+                <w:rFonts w:cstheme="minorHAnsi"/>
+                <w:bCs/>
+                <w:color w:val="auto"/>
+                <w:szCs w:val="20"/>
+                <w:lang w:eastAsia="zh-CN"/>
+              </w:rPr>
+              <w:t xml:space="preserve"> numerical cases, cross-rank token parity, and interactive prompts.</w:t>
             </w:r>
           </w:p>
         </w:tc>
@@ -1427,7 +1842,7 @@
           <w:p>
             <w:pPr>
               <w:rPr>
-                <w:rFonts w:ascii="黑体" w:eastAsia="黑体" w:hAnsi="黑体" w:cstheme="minorHAnsi" w:hint="eastAsia"/>
+                <w:rFonts w:ascii="Times New Roman" w:eastAsia="黑体" w:hAnsi="Times New Roman" w:cstheme="minorHAnsi" w:hint="eastAsia"/>
                 <w:b/>
                 <w:sz w:val="18"/>
                 <w:szCs w:val="18"/>
@@ -1435,7 +1850,7 @@
             </w:pPr>
             <w:r>
               <w:rPr>
-                <w:rFonts w:ascii="黑体" w:eastAsia="黑体" w:hAnsi="黑体" w:cstheme="minorHAnsi" w:hint="eastAsia"/>
+                <w:rFonts w:ascii="Times New Roman" w:eastAsia="黑体" w:hAnsi="Times New Roman" w:cstheme="minorHAnsi" w:hint="eastAsia"/>
                 <w:b/>
                 <w:sz w:val="18"/>
                 <w:szCs w:val="18"/>
@@ -1458,7 +1873,7 @@
             <w:pPr>
               <w:jc w:val="center"/>
               <w:rPr>
-                <w:rFonts w:ascii="黑体" w:eastAsia="黑体" w:hAnsi="黑体" w:cstheme="minorHAnsi" w:hint="eastAsia"/>
+                <w:rFonts w:ascii="Times New Roman" w:eastAsia="黑体" w:hAnsi="Times New Roman" w:cstheme="minorHAnsi" w:hint="eastAsia"/>
                 <w:sz w:val="18"/>
                 <w:szCs w:val="18"/>
               </w:rPr>
@@ -1481,7 +1896,7 @@
               <w:wordWrap w:val="0"/>
               <w:jc w:val="right"/>
               <w:rPr>
-                <w:rFonts w:ascii="黑体" w:eastAsia="黑体" w:hAnsi="黑体" w:cstheme="minorHAnsi" w:hint="eastAsia"/>
+                <w:rFonts w:ascii="Times New Roman" w:eastAsia="黑体" w:hAnsi="Times New Roman" w:cstheme="minorHAnsi" w:hint="eastAsia"/>
                 <w:b/>
                 <w:sz w:val="18"/>
                 <w:szCs w:val="18"/>
@@ -1491,6 +1906,7 @@
               <w:r>
                 <w:rPr>
                   <w:rStyle w:val="ab"/>
+                  <w:rFonts w:ascii="Times New Roman" w:hAnsi="Times New Roman"/>
                 </w:rPr>
                 <w:t>Token-Weighted CoT Distillation | AAAI 2027 Submission</w:t>
               </w:r>
@@ -1585,7 +2001,51 @@
                 <w:szCs w:val="20"/>
                 <w:lang w:eastAsia="zh-CN"/>
               </w:rPr>
-              <w:t xml:space="preserve"> Ran LoRA/DPO training and vLLM TP=4 evaluation. Qwen2.5-7B-Instruct reached 94.01%/94.00% accuracy on GSM8K/SVAMP, exceeding the strongest baselines by 5.51/10.10 percentage points. Revised manuscript submitted to AAAI 2027.</w:t>
+              <w:t xml:space="preserve"> Ran </w:t>
+            </w:r>
+            <w:proofErr w:type="spellStart"/>
+            <w:r>
+              <w:rPr>
+                <w:rFonts w:cstheme="minorHAnsi"/>
+                <w:bCs/>
+                <w:color w:val="auto"/>
+                <w:szCs w:val="20"/>
+                <w:lang w:eastAsia="zh-CN"/>
+              </w:rPr>
+              <w:t>LoRA</w:t>
+            </w:r>
+            <w:proofErr w:type="spellEnd"/>
+            <w:r>
+              <w:rPr>
+                <w:rFonts w:cstheme="minorHAnsi"/>
+                <w:bCs/>
+                <w:color w:val="auto"/>
+                <w:szCs w:val="20"/>
+                <w:lang w:eastAsia="zh-CN"/>
+              </w:rPr>
+              <w:t xml:space="preserve">/DPO training and </w:t>
+            </w:r>
+            <w:proofErr w:type="spellStart"/>
+            <w:r>
+              <w:rPr>
+                <w:rFonts w:cstheme="minorHAnsi"/>
+                <w:bCs/>
+                <w:color w:val="auto"/>
+                <w:szCs w:val="20"/>
+                <w:lang w:eastAsia="zh-CN"/>
+              </w:rPr>
+              <w:t>vLLM</w:t>
+            </w:r>
+            <w:proofErr w:type="spellEnd"/>
+            <w:r>
+              <w:rPr>
+                <w:rFonts w:cstheme="minorHAnsi"/>
+                <w:bCs/>
+                <w:color w:val="auto"/>
+                <w:szCs w:val="20"/>
+                <w:lang w:eastAsia="zh-CN"/>
+              </w:rPr>
+              <w:t xml:space="preserve"> TP=4 evaluation. Qwen2.5-7B-Instruct reached 94.01%/94.00% accuracy on GSM8K/SVAMP, exceeding the strongest baselines by 5.51/10.10 percentage points. Revised manuscript submitted to AAAI 2027.</w:t>
             </w:r>
           </w:p>
         </w:tc>
@@ -1595,7 +2055,7 @@
       <w:pPr>
         <w:spacing w:after="0" w:line="240" w:lineRule="auto"/>
         <w:rPr>
-          <w:rFonts w:cstheme="minorHAnsi"/>
+          <w:rFonts w:ascii="Times New Roman" w:hAnsi="Times New Roman" w:cstheme="minorHAnsi"/>
         </w:rPr>
       </w:pPr>
     </w:p>
@@ -1628,14 +2088,14 @@
           <w:p>
             <w:pPr>
               <w:rPr>
-                <w:rFonts w:cstheme="minorHAnsi"/>
+                <w:rFonts w:ascii="Times New Roman" w:hAnsi="Times New Roman" w:cstheme="minorHAnsi"/>
                 <w:b/>
                 <w:sz w:val="24"/>
               </w:rPr>
             </w:pPr>
             <w:r>
               <w:rPr>
-                <w:rFonts w:ascii="黑体" w:eastAsia="黑体" w:hAnsi="黑体" w:hint="eastAsia"/>
+                <w:rFonts w:ascii="Times New Roman" w:eastAsia="黑体" w:hAnsi="Times New Roman" w:hint="eastAsia"/>
                 <w:b/>
                 <w:sz w:val="24"/>
               </w:rPr>
@@ -1709,7 +2169,63 @@
               <w:rPr>
                 <w:bCs/>
               </w:rPr>
-              <w:t xml:space="preserve"> C/C++, Python, CUDA, Triton, PyTorch Extensions; vLLM, veRL, Megatron-LM, FlashInfer, CUTLASS, and NCCL.</w:t>
+              <w:t xml:space="preserve"> C/C++, Python, CUDA, Triton, </w:t>
+            </w:r>
+            <w:proofErr w:type="spellStart"/>
+            <w:r>
+              <w:rPr>
+                <w:bCs/>
+              </w:rPr>
+              <w:t>PyTorch</w:t>
+            </w:r>
+            <w:proofErr w:type="spellEnd"/>
+            <w:r>
+              <w:rPr>
+                <w:bCs/>
+              </w:rPr>
+              <w:t xml:space="preserve"> Extensions; </w:t>
+            </w:r>
+            <w:proofErr w:type="spellStart"/>
+            <w:r>
+              <w:rPr>
+                <w:bCs/>
+              </w:rPr>
+              <w:t>vLLM</w:t>
+            </w:r>
+            <w:proofErr w:type="spellEnd"/>
+            <w:r>
+              <w:rPr>
+                <w:bCs/>
+              </w:rPr>
+              <w:t xml:space="preserve">, </w:t>
+            </w:r>
+            <w:proofErr w:type="spellStart"/>
+            <w:r>
+              <w:rPr>
+                <w:bCs/>
+              </w:rPr>
+              <w:t>veRL</w:t>
+            </w:r>
+            <w:proofErr w:type="spellEnd"/>
+            <w:r>
+              <w:rPr>
+                <w:bCs/>
+              </w:rPr>
+              <w:t xml:space="preserve">, Megatron-LM, </w:t>
+            </w:r>
+            <w:proofErr w:type="spellStart"/>
+            <w:r>
+              <w:rPr>
+                <w:bCs/>
+              </w:rPr>
+              <w:t>FlashInfer</w:t>
+            </w:r>
+            <w:proofErr w:type="spellEnd"/>
+            <w:r>
+              <w:rPr>
+                <w:bCs/>
+              </w:rPr>
+              <w:t>, CUTLASS, and NCCL.</w:t>
             </w:r>
           </w:p>
           <w:p>
@@ -1746,7 +2262,7 @@
       <w:pPr>
         <w:spacing w:after="0" w:line="240" w:lineRule="auto"/>
         <w:rPr>
-          <w:rFonts w:cstheme="minorHAnsi"/>
+          <w:rFonts w:ascii="Times New Roman" w:hAnsi="Times New Roman" w:cstheme="minorHAnsi"/>
         </w:rPr>
       </w:pPr>
     </w:p>

</xml_diff>